<commit_message>
update the peer review
</commit_message>
<xml_diff>
--- a/peer_review.docx
+++ b/peer_review.docx
@@ -18,10 +18,10 @@
       <w:tblGrid>
         <w:gridCol w:w="1424"/>
         <w:gridCol w:w="1425"/>
-        <w:gridCol w:w="1424"/>
-        <w:gridCol w:w="1425"/>
-        <w:gridCol w:w="1424"/>
-        <w:gridCol w:w="1124"/>
+        <w:gridCol w:w="1423"/>
+        <w:gridCol w:w="1426"/>
+        <w:gridCol w:w="1423"/>
+        <w:gridCol w:w="1125"/>
         <w:gridCol w:w="1723"/>
       </w:tblGrid>
       <w:tr>
@@ -73,7 +73,7 @@
         </w:tc>
         <w:tc>
           <w:tcPr>
-            <w:tcW w:w="1424" w:type="dxa"/>
+            <w:tcW w:w="1423" w:type="dxa"/>
             <w:tcBorders>
               <w:top w:val="single" w:sz="4" w:space="0" w:color="000000"/>
               <w:start w:val="single" w:sz="4" w:space="0" w:color="000000"/>
@@ -95,7 +95,7 @@
         </w:tc>
         <w:tc>
           <w:tcPr>
-            <w:tcW w:w="1425" w:type="dxa"/>
+            <w:tcW w:w="1426" w:type="dxa"/>
             <w:tcBorders>
               <w:top w:val="single" w:sz="4" w:space="0" w:color="000000"/>
               <w:start w:val="single" w:sz="4" w:space="0" w:color="000000"/>
@@ -117,7 +117,7 @@
         </w:tc>
         <w:tc>
           <w:tcPr>
-            <w:tcW w:w="1424" w:type="dxa"/>
+            <w:tcW w:w="1423" w:type="dxa"/>
             <w:tcBorders>
               <w:top w:val="single" w:sz="4" w:space="0" w:color="000000"/>
               <w:start w:val="single" w:sz="4" w:space="0" w:color="000000"/>
@@ -139,7 +139,7 @@
         </w:tc>
         <w:tc>
           <w:tcPr>
-            <w:tcW w:w="1124" w:type="dxa"/>
+            <w:tcW w:w="1125" w:type="dxa"/>
             <w:tcBorders>
               <w:top w:val="single" w:sz="4" w:space="0" w:color="000000"/>
               <w:start w:val="single" w:sz="4" w:space="0" w:color="000000"/>
@@ -231,7 +231,7 @@
         </w:tc>
         <w:tc>
           <w:tcPr>
-            <w:tcW w:w="1424" w:type="dxa"/>
+            <w:tcW w:w="1423" w:type="dxa"/>
             <w:tcBorders>
               <w:top w:val="single" w:sz="4" w:space="0" w:color="000000"/>
               <w:start w:val="single" w:sz="4" w:space="0" w:color="000000"/>
@@ -253,7 +253,7 @@
         </w:tc>
         <w:tc>
           <w:tcPr>
-            <w:tcW w:w="1425" w:type="dxa"/>
+            <w:tcW w:w="1426" w:type="dxa"/>
             <w:tcBorders>
               <w:top w:val="single" w:sz="4" w:space="0" w:color="000000"/>
               <w:start w:val="single" w:sz="4" w:space="0" w:color="000000"/>
@@ -275,7 +275,7 @@
         </w:tc>
         <w:tc>
           <w:tcPr>
-            <w:tcW w:w="1424" w:type="dxa"/>
+            <w:tcW w:w="1423" w:type="dxa"/>
             <w:tcBorders>
               <w:top w:val="single" w:sz="4" w:space="0" w:color="000000"/>
               <w:start w:val="single" w:sz="4" w:space="0" w:color="000000"/>
@@ -297,7 +297,7 @@
         </w:tc>
         <w:tc>
           <w:tcPr>
-            <w:tcW w:w="1124" w:type="dxa"/>
+            <w:tcW w:w="1125" w:type="dxa"/>
             <w:tcBorders>
               <w:top w:val="single" w:sz="4" w:space="0" w:color="000000"/>
               <w:start w:val="single" w:sz="4" w:space="0" w:color="000000"/>
@@ -384,98 +384,102 @@
             </w:pPr>
             <w:r>
               <w:rPr/>
-            </w:r>
-          </w:p>
-        </w:tc>
-        <w:tc>
-          <w:tcPr>
-            <w:tcW w:w="1424" w:type="dxa"/>
-            <w:tcBorders>
-              <w:top w:val="single" w:sz="4" w:space="0" w:color="000000"/>
-              <w:start w:val="single" w:sz="4" w:space="0" w:color="000000"/>
-              <w:bottom w:val="single" w:sz="4" w:space="0" w:color="000000"/>
-              <w:end w:val="single" w:sz="4" w:space="0" w:color="000000"/>
-            </w:tcBorders>
-          </w:tcPr>
-          <w:p>
-            <w:pPr>
-              <w:pStyle w:val="TableContents"/>
-              <w:widowControl w:val="false"/>
-              <w:suppressLineNumbers/>
-              <w:bidi w:val="0"/>
-              <w:rPr/>
-            </w:pPr>
-            <w:r>
-              <w:rPr/>
-            </w:r>
-          </w:p>
-        </w:tc>
-        <w:tc>
-          <w:tcPr>
-            <w:tcW w:w="1425" w:type="dxa"/>
-            <w:tcBorders>
-              <w:top w:val="single" w:sz="4" w:space="0" w:color="000000"/>
-              <w:start w:val="single" w:sz="4" w:space="0" w:color="000000"/>
-              <w:bottom w:val="single" w:sz="4" w:space="0" w:color="000000"/>
-              <w:end w:val="single" w:sz="4" w:space="0" w:color="000000"/>
-            </w:tcBorders>
-          </w:tcPr>
-          <w:p>
-            <w:pPr>
-              <w:pStyle w:val="TableContents"/>
-              <w:widowControl w:val="false"/>
-              <w:suppressLineNumbers/>
-              <w:bidi w:val="0"/>
-              <w:rPr/>
-            </w:pPr>
-            <w:r>
-              <w:rPr/>
-            </w:r>
-          </w:p>
-        </w:tc>
-        <w:tc>
-          <w:tcPr>
-            <w:tcW w:w="1424" w:type="dxa"/>
-            <w:tcBorders>
-              <w:top w:val="single" w:sz="4" w:space="0" w:color="000000"/>
-              <w:start w:val="single" w:sz="4" w:space="0" w:color="000000"/>
-              <w:bottom w:val="single" w:sz="4" w:space="0" w:color="000000"/>
-              <w:end w:val="single" w:sz="4" w:space="0" w:color="000000"/>
-            </w:tcBorders>
-          </w:tcPr>
-          <w:p>
-            <w:pPr>
-              <w:pStyle w:val="TableContents"/>
-              <w:widowControl w:val="false"/>
-              <w:suppressLineNumbers/>
-              <w:bidi w:val="0"/>
-              <w:rPr/>
-            </w:pPr>
-            <w:r>
-              <w:rPr/>
-            </w:r>
-          </w:p>
-        </w:tc>
-        <w:tc>
-          <w:tcPr>
-            <w:tcW w:w="1124" w:type="dxa"/>
-            <w:tcBorders>
-              <w:top w:val="single" w:sz="4" w:space="0" w:color="000000"/>
-              <w:start w:val="single" w:sz="4" w:space="0" w:color="000000"/>
-              <w:bottom w:val="single" w:sz="4" w:space="0" w:color="000000"/>
-              <w:end w:val="single" w:sz="4" w:space="0" w:color="000000"/>
-            </w:tcBorders>
-          </w:tcPr>
-          <w:p>
-            <w:pPr>
-              <w:pStyle w:val="TableContents"/>
-              <w:widowControl w:val="false"/>
-              <w:suppressLineNumbers/>
-              <w:bidi w:val="0"/>
-              <w:rPr/>
-            </w:pPr>
-            <w:r>
-              <w:rPr/>
+              <w:t>10</w:t>
+            </w:r>
+          </w:p>
+        </w:tc>
+        <w:tc>
+          <w:tcPr>
+            <w:tcW w:w="1423" w:type="dxa"/>
+            <w:tcBorders>
+              <w:top w:val="single" w:sz="4" w:space="0" w:color="000000"/>
+              <w:start w:val="single" w:sz="4" w:space="0" w:color="000000"/>
+              <w:bottom w:val="single" w:sz="4" w:space="0" w:color="000000"/>
+              <w:end w:val="single" w:sz="4" w:space="0" w:color="000000"/>
+            </w:tcBorders>
+          </w:tcPr>
+          <w:p>
+            <w:pPr>
+              <w:pStyle w:val="TableContents"/>
+              <w:widowControl w:val="false"/>
+              <w:suppressLineNumbers/>
+              <w:bidi w:val="0"/>
+              <w:rPr/>
+            </w:pPr>
+            <w:r>
+              <w:rPr/>
+            </w:r>
+          </w:p>
+        </w:tc>
+        <w:tc>
+          <w:tcPr>
+            <w:tcW w:w="1426" w:type="dxa"/>
+            <w:tcBorders>
+              <w:top w:val="single" w:sz="4" w:space="0" w:color="000000"/>
+              <w:start w:val="single" w:sz="4" w:space="0" w:color="000000"/>
+              <w:bottom w:val="single" w:sz="4" w:space="0" w:color="000000"/>
+              <w:end w:val="single" w:sz="4" w:space="0" w:color="000000"/>
+            </w:tcBorders>
+          </w:tcPr>
+          <w:p>
+            <w:pPr>
+              <w:pStyle w:val="TableContents"/>
+              <w:widowControl w:val="false"/>
+              <w:suppressLineNumbers/>
+              <w:bidi w:val="0"/>
+              <w:rPr/>
+            </w:pPr>
+            <w:r>
+              <w:rPr/>
+              <w:t>10</w:t>
+            </w:r>
+          </w:p>
+        </w:tc>
+        <w:tc>
+          <w:tcPr>
+            <w:tcW w:w="1423" w:type="dxa"/>
+            <w:tcBorders>
+              <w:top w:val="single" w:sz="4" w:space="0" w:color="000000"/>
+              <w:start w:val="single" w:sz="4" w:space="0" w:color="000000"/>
+              <w:bottom w:val="single" w:sz="4" w:space="0" w:color="000000"/>
+              <w:end w:val="single" w:sz="4" w:space="0" w:color="000000"/>
+            </w:tcBorders>
+          </w:tcPr>
+          <w:p>
+            <w:pPr>
+              <w:pStyle w:val="TableContents"/>
+              <w:widowControl w:val="false"/>
+              <w:suppressLineNumbers/>
+              <w:bidi w:val="0"/>
+              <w:rPr/>
+            </w:pPr>
+            <w:r>
+              <w:rPr/>
+              <w:t>10</w:t>
+            </w:r>
+          </w:p>
+        </w:tc>
+        <w:tc>
+          <w:tcPr>
+            <w:tcW w:w="1125" w:type="dxa"/>
+            <w:tcBorders>
+              <w:top w:val="single" w:sz="4" w:space="0" w:color="000000"/>
+              <w:start w:val="single" w:sz="4" w:space="0" w:color="000000"/>
+              <w:bottom w:val="single" w:sz="4" w:space="0" w:color="000000"/>
+              <w:end w:val="single" w:sz="4" w:space="0" w:color="000000"/>
+            </w:tcBorders>
+          </w:tcPr>
+          <w:p>
+            <w:pPr>
+              <w:pStyle w:val="TableContents"/>
+              <w:widowControl w:val="false"/>
+              <w:suppressLineNumbers/>
+              <w:bidi w:val="0"/>
+              <w:rPr/>
+            </w:pPr>
+            <w:r>
+              <w:rPr/>
+              <w:t>10</w:t>
             </w:r>
           </w:p>
         </w:tc>
@@ -499,6 +503,7 @@
             </w:pPr>
             <w:r>
               <w:rPr/>
+              <w:t>Initial gas/oil selection</w:t>
             </w:r>
           </w:p>
         </w:tc>
@@ -552,76 +557,76 @@
         </w:tc>
         <w:tc>
           <w:tcPr>
-            <w:tcW w:w="1424" w:type="dxa"/>
-            <w:tcBorders>
-              <w:top w:val="single" w:sz="4" w:space="0" w:color="000000"/>
-              <w:start w:val="single" w:sz="4" w:space="0" w:color="000000"/>
-              <w:bottom w:val="single" w:sz="4" w:space="0" w:color="000000"/>
-              <w:end w:val="single" w:sz="4" w:space="0" w:color="000000"/>
-            </w:tcBorders>
-          </w:tcPr>
-          <w:p>
-            <w:pPr>
-              <w:pStyle w:val="TableContents"/>
-              <w:widowControl w:val="false"/>
-              <w:suppressLineNumbers/>
-              <w:bidi w:val="0"/>
-              <w:rPr/>
-            </w:pPr>
-            <w:r>
-              <w:rPr/>
-            </w:r>
-          </w:p>
-        </w:tc>
-        <w:tc>
-          <w:tcPr>
-            <w:tcW w:w="1425" w:type="dxa"/>
-            <w:tcBorders>
-              <w:top w:val="single" w:sz="4" w:space="0" w:color="000000"/>
-              <w:start w:val="single" w:sz="4" w:space="0" w:color="000000"/>
-              <w:bottom w:val="single" w:sz="4" w:space="0" w:color="000000"/>
-              <w:end w:val="single" w:sz="4" w:space="0" w:color="000000"/>
-            </w:tcBorders>
-          </w:tcPr>
-          <w:p>
-            <w:pPr>
-              <w:pStyle w:val="TableContents"/>
-              <w:widowControl w:val="false"/>
-              <w:suppressLineNumbers/>
-              <w:bidi w:val="0"/>
-              <w:rPr/>
-            </w:pPr>
-            <w:r>
-              <w:rPr/>
-            </w:r>
-          </w:p>
-        </w:tc>
-        <w:tc>
-          <w:tcPr>
-            <w:tcW w:w="1424" w:type="dxa"/>
-            <w:tcBorders>
-              <w:top w:val="single" w:sz="4" w:space="0" w:color="000000"/>
-              <w:start w:val="single" w:sz="4" w:space="0" w:color="000000"/>
-              <w:bottom w:val="single" w:sz="4" w:space="0" w:color="000000"/>
-              <w:end w:val="single" w:sz="4" w:space="0" w:color="000000"/>
-            </w:tcBorders>
-          </w:tcPr>
-          <w:p>
-            <w:pPr>
-              <w:pStyle w:val="TableContents"/>
-              <w:widowControl w:val="false"/>
-              <w:suppressLineNumbers/>
-              <w:bidi w:val="0"/>
-              <w:rPr/>
-            </w:pPr>
-            <w:r>
-              <w:rPr/>
-            </w:r>
-          </w:p>
-        </w:tc>
-        <w:tc>
-          <w:tcPr>
-            <w:tcW w:w="1124" w:type="dxa"/>
+            <w:tcW w:w="1423" w:type="dxa"/>
+            <w:tcBorders>
+              <w:top w:val="single" w:sz="4" w:space="0" w:color="000000"/>
+              <w:start w:val="single" w:sz="4" w:space="0" w:color="000000"/>
+              <w:bottom w:val="single" w:sz="4" w:space="0" w:color="000000"/>
+              <w:end w:val="single" w:sz="4" w:space="0" w:color="000000"/>
+            </w:tcBorders>
+          </w:tcPr>
+          <w:p>
+            <w:pPr>
+              <w:pStyle w:val="TableContents"/>
+              <w:widowControl w:val="false"/>
+              <w:suppressLineNumbers/>
+              <w:bidi w:val="0"/>
+              <w:rPr/>
+            </w:pPr>
+            <w:r>
+              <w:rPr/>
+            </w:r>
+          </w:p>
+        </w:tc>
+        <w:tc>
+          <w:tcPr>
+            <w:tcW w:w="1426" w:type="dxa"/>
+            <w:tcBorders>
+              <w:top w:val="single" w:sz="4" w:space="0" w:color="000000"/>
+              <w:start w:val="single" w:sz="4" w:space="0" w:color="000000"/>
+              <w:bottom w:val="single" w:sz="4" w:space="0" w:color="000000"/>
+              <w:end w:val="single" w:sz="4" w:space="0" w:color="000000"/>
+            </w:tcBorders>
+          </w:tcPr>
+          <w:p>
+            <w:pPr>
+              <w:pStyle w:val="TableContents"/>
+              <w:widowControl w:val="false"/>
+              <w:suppressLineNumbers/>
+              <w:bidi w:val="0"/>
+              <w:rPr/>
+            </w:pPr>
+            <w:r>
+              <w:rPr/>
+            </w:r>
+          </w:p>
+        </w:tc>
+        <w:tc>
+          <w:tcPr>
+            <w:tcW w:w="1423" w:type="dxa"/>
+            <w:tcBorders>
+              <w:top w:val="single" w:sz="4" w:space="0" w:color="000000"/>
+              <w:start w:val="single" w:sz="4" w:space="0" w:color="000000"/>
+              <w:bottom w:val="single" w:sz="4" w:space="0" w:color="000000"/>
+              <w:end w:val="single" w:sz="4" w:space="0" w:color="000000"/>
+            </w:tcBorders>
+          </w:tcPr>
+          <w:p>
+            <w:pPr>
+              <w:pStyle w:val="TableContents"/>
+              <w:widowControl w:val="false"/>
+              <w:suppressLineNumbers/>
+              <w:bidi w:val="0"/>
+              <w:rPr/>
+            </w:pPr>
+            <w:r>
+              <w:rPr/>
+            </w:r>
+          </w:p>
+        </w:tc>
+        <w:tc>
+          <w:tcPr>
+            <w:tcW w:w="1125" w:type="dxa"/>
             <w:tcBorders>
               <w:top w:val="single" w:sz="4" w:space="0" w:color="000000"/>
               <w:start w:val="single" w:sz="4" w:space="0" w:color="000000"/>
@@ -715,76 +720,76 @@
         </w:tc>
         <w:tc>
           <w:tcPr>
-            <w:tcW w:w="1424" w:type="dxa"/>
-            <w:tcBorders>
-              <w:top w:val="single" w:sz="4" w:space="0" w:color="000000"/>
-              <w:start w:val="single" w:sz="4" w:space="0" w:color="000000"/>
-              <w:bottom w:val="single" w:sz="4" w:space="0" w:color="000000"/>
-              <w:end w:val="single" w:sz="4" w:space="0" w:color="000000"/>
-            </w:tcBorders>
-          </w:tcPr>
-          <w:p>
-            <w:pPr>
-              <w:pStyle w:val="TableContents"/>
-              <w:widowControl w:val="false"/>
-              <w:suppressLineNumbers/>
-              <w:bidi w:val="0"/>
-              <w:rPr/>
-            </w:pPr>
-            <w:r>
-              <w:rPr/>
-            </w:r>
-          </w:p>
-        </w:tc>
-        <w:tc>
-          <w:tcPr>
-            <w:tcW w:w="1425" w:type="dxa"/>
-            <w:tcBorders>
-              <w:top w:val="single" w:sz="4" w:space="0" w:color="000000"/>
-              <w:start w:val="single" w:sz="4" w:space="0" w:color="000000"/>
-              <w:bottom w:val="single" w:sz="4" w:space="0" w:color="000000"/>
-              <w:end w:val="single" w:sz="4" w:space="0" w:color="000000"/>
-            </w:tcBorders>
-          </w:tcPr>
-          <w:p>
-            <w:pPr>
-              <w:pStyle w:val="TableContents"/>
-              <w:widowControl w:val="false"/>
-              <w:suppressLineNumbers/>
-              <w:bidi w:val="0"/>
-              <w:rPr/>
-            </w:pPr>
-            <w:r>
-              <w:rPr/>
-            </w:r>
-          </w:p>
-        </w:tc>
-        <w:tc>
-          <w:tcPr>
-            <w:tcW w:w="1424" w:type="dxa"/>
-            <w:tcBorders>
-              <w:top w:val="single" w:sz="4" w:space="0" w:color="000000"/>
-              <w:start w:val="single" w:sz="4" w:space="0" w:color="000000"/>
-              <w:bottom w:val="single" w:sz="4" w:space="0" w:color="000000"/>
-              <w:end w:val="single" w:sz="4" w:space="0" w:color="000000"/>
-            </w:tcBorders>
-          </w:tcPr>
-          <w:p>
-            <w:pPr>
-              <w:pStyle w:val="TableContents"/>
-              <w:widowControl w:val="false"/>
-              <w:suppressLineNumbers/>
-              <w:bidi w:val="0"/>
-              <w:rPr/>
-            </w:pPr>
-            <w:r>
-              <w:rPr/>
-            </w:r>
-          </w:p>
-        </w:tc>
-        <w:tc>
-          <w:tcPr>
-            <w:tcW w:w="1124" w:type="dxa"/>
+            <w:tcW w:w="1423" w:type="dxa"/>
+            <w:tcBorders>
+              <w:top w:val="single" w:sz="4" w:space="0" w:color="000000"/>
+              <w:start w:val="single" w:sz="4" w:space="0" w:color="000000"/>
+              <w:bottom w:val="single" w:sz="4" w:space="0" w:color="000000"/>
+              <w:end w:val="single" w:sz="4" w:space="0" w:color="000000"/>
+            </w:tcBorders>
+          </w:tcPr>
+          <w:p>
+            <w:pPr>
+              <w:pStyle w:val="TableContents"/>
+              <w:widowControl w:val="false"/>
+              <w:suppressLineNumbers/>
+              <w:bidi w:val="0"/>
+              <w:rPr/>
+            </w:pPr>
+            <w:r>
+              <w:rPr/>
+            </w:r>
+          </w:p>
+        </w:tc>
+        <w:tc>
+          <w:tcPr>
+            <w:tcW w:w="1426" w:type="dxa"/>
+            <w:tcBorders>
+              <w:top w:val="single" w:sz="4" w:space="0" w:color="000000"/>
+              <w:start w:val="single" w:sz="4" w:space="0" w:color="000000"/>
+              <w:bottom w:val="single" w:sz="4" w:space="0" w:color="000000"/>
+              <w:end w:val="single" w:sz="4" w:space="0" w:color="000000"/>
+            </w:tcBorders>
+          </w:tcPr>
+          <w:p>
+            <w:pPr>
+              <w:pStyle w:val="TableContents"/>
+              <w:widowControl w:val="false"/>
+              <w:suppressLineNumbers/>
+              <w:bidi w:val="0"/>
+              <w:rPr/>
+            </w:pPr>
+            <w:r>
+              <w:rPr/>
+            </w:r>
+          </w:p>
+        </w:tc>
+        <w:tc>
+          <w:tcPr>
+            <w:tcW w:w="1423" w:type="dxa"/>
+            <w:tcBorders>
+              <w:top w:val="single" w:sz="4" w:space="0" w:color="000000"/>
+              <w:start w:val="single" w:sz="4" w:space="0" w:color="000000"/>
+              <w:bottom w:val="single" w:sz="4" w:space="0" w:color="000000"/>
+              <w:end w:val="single" w:sz="4" w:space="0" w:color="000000"/>
+            </w:tcBorders>
+          </w:tcPr>
+          <w:p>
+            <w:pPr>
+              <w:pStyle w:val="TableContents"/>
+              <w:widowControl w:val="false"/>
+              <w:suppressLineNumbers/>
+              <w:bidi w:val="0"/>
+              <w:rPr/>
+            </w:pPr>
+            <w:r>
+              <w:rPr/>
+            </w:r>
+          </w:p>
+        </w:tc>
+        <w:tc>
+          <w:tcPr>
+            <w:tcW w:w="1125" w:type="dxa"/>
             <w:tcBorders>
               <w:top w:val="single" w:sz="4" w:space="0" w:color="000000"/>
               <w:start w:val="single" w:sz="4" w:space="0" w:color="000000"/>
@@ -878,76 +883,76 @@
         </w:tc>
         <w:tc>
           <w:tcPr>
-            <w:tcW w:w="1424" w:type="dxa"/>
-            <w:tcBorders>
-              <w:top w:val="single" w:sz="4" w:space="0" w:color="000000"/>
-              <w:start w:val="single" w:sz="4" w:space="0" w:color="000000"/>
-              <w:bottom w:val="single" w:sz="4" w:space="0" w:color="000000"/>
-              <w:end w:val="single" w:sz="4" w:space="0" w:color="000000"/>
-            </w:tcBorders>
-          </w:tcPr>
-          <w:p>
-            <w:pPr>
-              <w:pStyle w:val="TableContents"/>
-              <w:widowControl w:val="false"/>
-              <w:suppressLineNumbers/>
-              <w:bidi w:val="0"/>
-              <w:rPr/>
-            </w:pPr>
-            <w:r>
-              <w:rPr/>
-            </w:r>
-          </w:p>
-        </w:tc>
-        <w:tc>
-          <w:tcPr>
-            <w:tcW w:w="1425" w:type="dxa"/>
-            <w:tcBorders>
-              <w:top w:val="single" w:sz="4" w:space="0" w:color="000000"/>
-              <w:start w:val="single" w:sz="4" w:space="0" w:color="000000"/>
-              <w:bottom w:val="single" w:sz="4" w:space="0" w:color="000000"/>
-              <w:end w:val="single" w:sz="4" w:space="0" w:color="000000"/>
-            </w:tcBorders>
-          </w:tcPr>
-          <w:p>
-            <w:pPr>
-              <w:pStyle w:val="TableContents"/>
-              <w:widowControl w:val="false"/>
-              <w:suppressLineNumbers/>
-              <w:bidi w:val="0"/>
-              <w:rPr/>
-            </w:pPr>
-            <w:r>
-              <w:rPr/>
-            </w:r>
-          </w:p>
-        </w:tc>
-        <w:tc>
-          <w:tcPr>
-            <w:tcW w:w="1424" w:type="dxa"/>
-            <w:tcBorders>
-              <w:top w:val="single" w:sz="4" w:space="0" w:color="000000"/>
-              <w:start w:val="single" w:sz="4" w:space="0" w:color="000000"/>
-              <w:bottom w:val="single" w:sz="4" w:space="0" w:color="000000"/>
-              <w:end w:val="single" w:sz="4" w:space="0" w:color="000000"/>
-            </w:tcBorders>
-          </w:tcPr>
-          <w:p>
-            <w:pPr>
-              <w:pStyle w:val="TableContents"/>
-              <w:widowControl w:val="false"/>
-              <w:suppressLineNumbers/>
-              <w:bidi w:val="0"/>
-              <w:rPr/>
-            </w:pPr>
-            <w:r>
-              <w:rPr/>
-            </w:r>
-          </w:p>
-        </w:tc>
-        <w:tc>
-          <w:tcPr>
-            <w:tcW w:w="1124" w:type="dxa"/>
+            <w:tcW w:w="1423" w:type="dxa"/>
+            <w:tcBorders>
+              <w:top w:val="single" w:sz="4" w:space="0" w:color="000000"/>
+              <w:start w:val="single" w:sz="4" w:space="0" w:color="000000"/>
+              <w:bottom w:val="single" w:sz="4" w:space="0" w:color="000000"/>
+              <w:end w:val="single" w:sz="4" w:space="0" w:color="000000"/>
+            </w:tcBorders>
+          </w:tcPr>
+          <w:p>
+            <w:pPr>
+              <w:pStyle w:val="TableContents"/>
+              <w:widowControl w:val="false"/>
+              <w:suppressLineNumbers/>
+              <w:bidi w:val="0"/>
+              <w:rPr/>
+            </w:pPr>
+            <w:r>
+              <w:rPr/>
+            </w:r>
+          </w:p>
+        </w:tc>
+        <w:tc>
+          <w:tcPr>
+            <w:tcW w:w="1426" w:type="dxa"/>
+            <w:tcBorders>
+              <w:top w:val="single" w:sz="4" w:space="0" w:color="000000"/>
+              <w:start w:val="single" w:sz="4" w:space="0" w:color="000000"/>
+              <w:bottom w:val="single" w:sz="4" w:space="0" w:color="000000"/>
+              <w:end w:val="single" w:sz="4" w:space="0" w:color="000000"/>
+            </w:tcBorders>
+          </w:tcPr>
+          <w:p>
+            <w:pPr>
+              <w:pStyle w:val="TableContents"/>
+              <w:widowControl w:val="false"/>
+              <w:suppressLineNumbers/>
+              <w:bidi w:val="0"/>
+              <w:rPr/>
+            </w:pPr>
+            <w:r>
+              <w:rPr/>
+            </w:r>
+          </w:p>
+        </w:tc>
+        <w:tc>
+          <w:tcPr>
+            <w:tcW w:w="1423" w:type="dxa"/>
+            <w:tcBorders>
+              <w:top w:val="single" w:sz="4" w:space="0" w:color="000000"/>
+              <w:start w:val="single" w:sz="4" w:space="0" w:color="000000"/>
+              <w:bottom w:val="single" w:sz="4" w:space="0" w:color="000000"/>
+              <w:end w:val="single" w:sz="4" w:space="0" w:color="000000"/>
+            </w:tcBorders>
+          </w:tcPr>
+          <w:p>
+            <w:pPr>
+              <w:pStyle w:val="TableContents"/>
+              <w:widowControl w:val="false"/>
+              <w:suppressLineNumbers/>
+              <w:bidi w:val="0"/>
+              <w:rPr/>
+            </w:pPr>
+            <w:r>
+              <w:rPr/>
+            </w:r>
+          </w:p>
+        </w:tc>
+        <w:tc>
+          <w:tcPr>
+            <w:tcW w:w="1125" w:type="dxa"/>
             <w:tcBorders>
               <w:top w:val="single" w:sz="4" w:space="0" w:color="000000"/>
               <w:start w:val="single" w:sz="4" w:space="0" w:color="000000"/>
@@ -1010,6 +1015,7 @@
       <w:pgNumType w:fmt="decimal"/>
       <w:formProt w:val="false"/>
       <w:textDirection w:val="lrTb"/>
+      <w:docGrid w:type="default" w:linePitch="100" w:charSpace="0"/>
     </w:sectPr>
   </w:body>
 </w:document>
@@ -1029,7 +1035,6 @@
     </w:rPrDefault>
     <w:pPrDefault>
       <w:pPr>
-        <w:widowControl/>
         <w:suppressAutoHyphens w:val="true"/>
       </w:pPr>
     </w:pPrDefault>
@@ -1039,7 +1044,10 @@
     <w:qFormat/>
     <w:pPr>
       <w:widowControl/>
+      <w:suppressAutoHyphens w:val="true"/>
       <w:bidi w:val="0"/>
+      <w:spacing w:before="0" w:after="0"/>
+      <w:jc w:val="start"/>
     </w:pPr>
     <w:rPr>
       <w:rFonts w:ascii="Liberation Serif" w:hAnsi="Liberation Serif" w:eastAsia="NSimSun" w:cs="Arial"/>

</xml_diff>

<commit_message>
Add information to peer_review.docx
- Add my peer ratings
- Replace blank spaces with "N/A"
- Add averages row
</commit_message>
<xml_diff>
--- a/peer_review.docx
+++ b/peer_review.docx
@@ -177,7 +177,11 @@
             </w:pPr>
             <w:r>
               <w:rPr/>
-              <w:t xml:space="preserve">Responsibilities </w:t>
+              <w:t>Completed Tasks</w:t>
+            </w:r>
+            <w:r>
+              <w:rPr/>
+              <w:t xml:space="preserve"> </w:t>
             </w:r>
           </w:p>
         </w:tc>
@@ -226,6 +230,7 @@
             </w:pPr>
             <w:r>
               <w:rPr/>
+              <w:t>N/A</w:t>
             </w:r>
           </w:p>
         </w:tc>
@@ -384,7 +389,6 @@
             </w:pPr>
             <w:r>
               <w:rPr/>
-              <w:t>10</w:t>
             </w:r>
           </w:p>
         </w:tc>
@@ -431,7 +435,6 @@
             </w:pPr>
             <w:r>
               <w:rPr/>
-              <w:t>10</w:t>
             </w:r>
           </w:p>
         </w:tc>
@@ -455,7 +458,6 @@
             </w:pPr>
             <w:r>
               <w:rPr/>
-              <w:t>10</w:t>
             </w:r>
           </w:p>
         </w:tc>
@@ -479,7 +481,6 @@
             </w:pPr>
             <w:r>
               <w:rPr/>
-              <w:t>10</w:t>
             </w:r>
           </w:p>
         </w:tc>
@@ -503,7 +504,6 @@
             </w:pPr>
             <w:r>
               <w:rPr/>
-              <w:t>Initial gas/oil selection</w:t>
             </w:r>
           </w:p>
         </w:tc>
@@ -552,6 +552,7 @@
             </w:pPr>
             <w:r>
               <w:rPr/>
+              <w:t>10</w:t>
             </w:r>
           </w:p>
         </w:tc>
@@ -575,6 +576,7 @@
             </w:pPr>
             <w:r>
               <w:rPr/>
+              <w:t>10</w:t>
             </w:r>
           </w:p>
         </w:tc>
@@ -598,6 +600,7 @@
             </w:pPr>
             <w:r>
               <w:rPr/>
+              <w:t>N/A</w:t>
             </w:r>
           </w:p>
         </w:tc>
@@ -621,6 +624,7 @@
             </w:pPr>
             <w:r>
               <w:rPr/>
+              <w:t>10</w:t>
             </w:r>
           </w:p>
         </w:tc>
@@ -644,6 +648,7 @@
             </w:pPr>
             <w:r>
               <w:rPr/>
+              <w:t>10</w:t>
             </w:r>
           </w:p>
         </w:tc>
@@ -667,6 +672,20 @@
             </w:pPr>
             <w:r>
               <w:rPr/>
+              <w:t>-Oil Calculations</w:t>
+            </w:r>
+          </w:p>
+          <w:p>
+            <w:pPr>
+              <w:pStyle w:val="TableContents"/>
+              <w:widowControl w:val="false"/>
+              <w:suppressLineNumbers/>
+              <w:bidi w:val="0"/>
+              <w:rPr/>
+            </w:pPr>
+            <w:r>
+              <w:rPr/>
+              <w:t>-Province codes</w:t>
             </w:r>
           </w:p>
         </w:tc>
@@ -993,6 +1012,168 @@
             </w:pPr>
             <w:r>
               <w:rPr/>
+            </w:r>
+          </w:p>
+        </w:tc>
+      </w:tr>
+      <w:tr>
+        <w:trPr/>
+        <w:tc>
+          <w:tcPr>
+            <w:tcW w:w="1424" w:type="dxa"/>
+            <w:tcBorders>
+              <w:start w:val="single" w:sz="4" w:space="0" w:color="000000"/>
+              <w:bottom w:val="single" w:sz="4" w:space="0" w:color="000000"/>
+              <w:end w:val="single" w:sz="4" w:space="0" w:color="000000"/>
+            </w:tcBorders>
+          </w:tcPr>
+          <w:p>
+            <w:pPr>
+              <w:pStyle w:val="TableContents"/>
+              <w:bidi w:val="0"/>
+              <w:rPr/>
+            </w:pPr>
+            <w:r>
+              <w:rPr/>
+              <w:t>Average</w:t>
+            </w:r>
+          </w:p>
+        </w:tc>
+        <w:tc>
+          <w:tcPr>
+            <w:tcW w:w="1425" w:type="dxa"/>
+            <w:tcBorders>
+              <w:start w:val="single" w:sz="4" w:space="0" w:color="000000"/>
+              <w:bottom w:val="single" w:sz="4" w:space="0" w:color="000000"/>
+              <w:end w:val="single" w:sz="4" w:space="0" w:color="000000"/>
+            </w:tcBorders>
+          </w:tcPr>
+          <w:p>
+            <w:pPr>
+              <w:pStyle w:val="TableContents"/>
+              <w:widowControl w:val="false"/>
+              <w:suppressLineNumbers/>
+              <w:bidi w:val="0"/>
+              <w:rPr/>
+            </w:pPr>
+            <w:r>
+              <w:rPr/>
+              <w:t>10</w:t>
+            </w:r>
+          </w:p>
+        </w:tc>
+        <w:tc>
+          <w:tcPr>
+            <w:tcW w:w="1423" w:type="dxa"/>
+            <w:tcBorders>
+              <w:start w:val="single" w:sz="4" w:space="0" w:color="000000"/>
+              <w:bottom w:val="single" w:sz="4" w:space="0" w:color="000000"/>
+              <w:end w:val="single" w:sz="4" w:space="0" w:color="000000"/>
+            </w:tcBorders>
+          </w:tcPr>
+          <w:p>
+            <w:pPr>
+              <w:pStyle w:val="TableContents"/>
+              <w:widowControl w:val="false"/>
+              <w:suppressLineNumbers/>
+              <w:bidi w:val="0"/>
+              <w:rPr/>
+            </w:pPr>
+            <w:r>
+              <w:rPr/>
+              <w:t>10</w:t>
+            </w:r>
+          </w:p>
+        </w:tc>
+        <w:tc>
+          <w:tcPr>
+            <w:tcW w:w="1426" w:type="dxa"/>
+            <w:tcBorders>
+              <w:start w:val="single" w:sz="4" w:space="0" w:color="000000"/>
+              <w:bottom w:val="single" w:sz="4" w:space="0" w:color="000000"/>
+              <w:end w:val="single" w:sz="4" w:space="0" w:color="000000"/>
+            </w:tcBorders>
+          </w:tcPr>
+          <w:p>
+            <w:pPr>
+              <w:pStyle w:val="TableContents"/>
+              <w:widowControl w:val="false"/>
+              <w:suppressLineNumbers/>
+              <w:bidi w:val="0"/>
+              <w:rPr/>
+            </w:pPr>
+            <w:r>
+              <w:rPr/>
+              <w:t>10</w:t>
+            </w:r>
+          </w:p>
+        </w:tc>
+        <w:tc>
+          <w:tcPr>
+            <w:tcW w:w="1423" w:type="dxa"/>
+            <w:tcBorders>
+              <w:start w:val="single" w:sz="4" w:space="0" w:color="000000"/>
+              <w:bottom w:val="single" w:sz="4" w:space="0" w:color="000000"/>
+              <w:end w:val="single" w:sz="4" w:space="0" w:color="000000"/>
+            </w:tcBorders>
+          </w:tcPr>
+          <w:p>
+            <w:pPr>
+              <w:pStyle w:val="TableContents"/>
+              <w:widowControl w:val="false"/>
+              <w:suppressLineNumbers/>
+              <w:bidi w:val="0"/>
+              <w:rPr/>
+            </w:pPr>
+            <w:r>
+              <w:rPr/>
+              <w:t>10</w:t>
+            </w:r>
+          </w:p>
+        </w:tc>
+        <w:tc>
+          <w:tcPr>
+            <w:tcW w:w="1125" w:type="dxa"/>
+            <w:tcBorders>
+              <w:start w:val="single" w:sz="4" w:space="0" w:color="000000"/>
+              <w:bottom w:val="single" w:sz="4" w:space="0" w:color="000000"/>
+              <w:end w:val="single" w:sz="4" w:space="0" w:color="000000"/>
+            </w:tcBorders>
+          </w:tcPr>
+          <w:p>
+            <w:pPr>
+              <w:pStyle w:val="TableContents"/>
+              <w:widowControl w:val="false"/>
+              <w:suppressLineNumbers/>
+              <w:bidi w:val="0"/>
+              <w:rPr/>
+            </w:pPr>
+            <w:r>
+              <w:rPr/>
+              <w:t>10</w:t>
+            </w:r>
+          </w:p>
+        </w:tc>
+        <w:tc>
+          <w:tcPr>
+            <w:tcW w:w="1723" w:type="dxa"/>
+            <w:tcBorders>
+              <w:start w:val="single" w:sz="4" w:space="0" w:color="000000"/>
+              <w:bottom w:val="single" w:sz="4" w:space="0" w:color="000000"/>
+              <w:end w:val="single" w:sz="4" w:space="0" w:color="000000"/>
+            </w:tcBorders>
+          </w:tcPr>
+          <w:p>
+            <w:pPr>
+              <w:pStyle w:val="TableContents"/>
+              <w:widowControl w:val="false"/>
+              <w:suppressLineNumbers/>
+              <w:bidi w:val="0"/>
+              <w:rPr/>
+            </w:pPr>
+            <w:r>
+              <w:rPr/>
+              <w:t>N/A</w:t>
             </w:r>
           </w:p>
         </w:tc>

</xml_diff>